<commit_message>
ADDED: color filter mode and toast notifications CHANGED: improved R error messages REMOVED: hitmiss compare button CHANGED: Excel file automatically highlighted REMOVED: AIC LED CHANGED: buttons more consistent ADDED: QQ plot icon
</commit_message>
<xml_diff>
--- a/POD Source Code/Notes to Programmer.docx
+++ b/POD Source Code/Notes to Programmer.docx
@@ -1,6 +1,6 @@
 
 <file path=word/document.xml><?xml version="1.0" encoding="utf-8"?>
-<w:document xmlns:wpc="http://schemas.microsoft.com/office/word/2010/wordprocessingCanvas" xmlns:cx="http://schemas.microsoft.com/office/drawing/2014/chartex" xmlns:cx1="http://schemas.microsoft.com/office/drawing/2015/9/8/chartex" xmlns:mc="http://schemas.openxmlformats.org/markup-compatibility/2006" xmlns:o="urn:schemas-microsoft-com:office:office" xmlns:r="http://schemas.openxmlformats.org/officeDocument/2006/relationships" xmlns:m="http://schemas.openxmlformats.org/officeDocument/2006/math" xmlns:v="urn:schemas-microsoft-com:vml" xmlns:wp14="http://schemas.microsoft.com/office/word/2010/wordprocessingDrawing" xmlns:wp="http://schemas.openxmlformats.org/drawingml/2006/wordprocessingDrawing" xmlns:w10="urn:schemas-microsoft-com:office:word" xmlns:w="http://schemas.openxmlformats.org/wordprocessingml/2006/main" xmlns:w14="http://schemas.microsoft.com/office/word/2010/wordml" xmlns:w15="http://schemas.microsoft.com/office/word/2012/wordml" xmlns:w16se="http://schemas.microsoft.com/office/word/2015/wordml/symex" xmlns:wpg="http://schemas.microsoft.com/office/word/2010/wordprocessingGroup" xmlns:wpi="http://schemas.microsoft.com/office/word/2010/wordprocessingInk" xmlns:wne="http://schemas.microsoft.com/office/word/2006/wordml" xmlns:wps="http://schemas.microsoft.com/office/word/2010/wordprocessingShape" mc:Ignorable="w14 w15 w16se wp14">
+<w:document xmlns:wpc="http://schemas.microsoft.com/office/word/2010/wordprocessingCanvas" xmlns:cx="http://schemas.microsoft.com/office/drawing/2014/chartex" xmlns:cx1="http://schemas.microsoft.com/office/drawing/2015/9/8/chartex" xmlns:cx2="http://schemas.microsoft.com/office/drawing/2015/10/21/chartex" xmlns:cx3="http://schemas.microsoft.com/office/drawing/2016/5/9/chartex" xmlns:cx4="http://schemas.microsoft.com/office/drawing/2016/5/10/chartex" xmlns:cx5="http://schemas.microsoft.com/office/drawing/2016/5/11/chartex" xmlns:cx6="http://schemas.microsoft.com/office/drawing/2016/5/12/chartex" xmlns:cx7="http://schemas.microsoft.com/office/drawing/2016/5/13/chartex" xmlns:cx8="http://schemas.microsoft.com/office/drawing/2016/5/14/chartex" xmlns:mc="http://schemas.openxmlformats.org/markup-compatibility/2006" xmlns:aink="http://schemas.microsoft.com/office/drawing/2016/ink" xmlns:am3d="http://schemas.microsoft.com/office/drawing/2017/model3d" xmlns:o="urn:schemas-microsoft-com:office:office" xmlns:oel="http://schemas.microsoft.com/office/2019/extlst" xmlns:r="http://schemas.openxmlformats.org/officeDocument/2006/relationships" xmlns:m="http://schemas.openxmlformats.org/officeDocument/2006/math" xmlns:v="urn:schemas-microsoft-com:vml" xmlns:wp14="http://schemas.microsoft.com/office/word/2010/wordprocessingDrawing" xmlns:wp="http://schemas.openxmlformats.org/drawingml/2006/wordprocessingDrawing" xmlns:w10="urn:schemas-microsoft-com:office:word" xmlns:w="http://schemas.openxmlformats.org/wordprocessingml/2006/main" xmlns:w14="http://schemas.microsoft.com/office/word/2010/wordml" xmlns:w15="http://schemas.microsoft.com/office/word/2012/wordml" xmlns:w16cex="http://schemas.microsoft.com/office/word/2018/wordml/cex" xmlns:w16cid="http://schemas.microsoft.com/office/word/2016/wordml/cid" xmlns:w16="http://schemas.microsoft.com/office/word/2018/wordml" xmlns:w16du="http://schemas.microsoft.com/office/word/2023/wordml/word16du" xmlns:w16sdtdh="http://schemas.microsoft.com/office/word/2020/wordml/sdtdatahash" xmlns:w16sdtfl="http://schemas.microsoft.com/office/word/2024/wordml/sdtformatlock" xmlns:w16se="http://schemas.microsoft.com/office/word/2015/wordml/symex" xmlns:wpg="http://schemas.microsoft.com/office/word/2010/wordprocessingGroup" xmlns:wpi="http://schemas.microsoft.com/office/word/2010/wordprocessingInk" xmlns:wne="http://schemas.microsoft.com/office/word/2006/wordml" xmlns:wps="http://schemas.microsoft.com/office/word/2010/wordprocessingShape" mc:Ignorable="w14 w15 w16se w16cid w16 w16cex w16sdtdh w16sdtfl w16du wp14">
   <w:body>
     <w:p>
       <w:r>
@@ -40,15 +40,7 @@
       </w:r>
       <w:proofErr w:type="spellEnd"/>
       <w:r>
-        <w:t xml:space="preserve">, so building the project from a </w:t>
-      </w:r>
-      <w:proofErr w:type="spellStart"/>
-      <w:r>
-        <w:t>git</w:t>
-      </w:r>
-      <w:proofErr w:type="spellEnd"/>
-      <w:r>
-        <w:t xml:space="preserve"> clone should be ‘plug and play’ once the starting project is set as </w:t>
+        <w:t xml:space="preserve">, so building the project from a git clone should be ‘plug and play’ once the starting project is set as </w:t>
       </w:r>
       <w:r>
         <w:rPr>
@@ -138,56 +130,6 @@
         <w:t xml:space="preserve">/. </w:t>
       </w:r>
     </w:p>
-    <w:p>
-      <w:pPr>
-        <w:ind w:firstLine="720"/>
-      </w:pPr>
-      <w:r>
-        <w:t xml:space="preserve">*** If any additional support is needed, an issue can be opened in PODv4.5’s </w:t>
-      </w:r>
-      <w:proofErr w:type="spellStart"/>
-      <w:r>
-        <w:t>github</w:t>
-      </w:r>
-      <w:proofErr w:type="spellEnd"/>
-      <w:r>
-        <w:t xml:space="preserve"> repository online </w:t>
-      </w:r>
-      <w:proofErr w:type="gramStart"/>
-      <w:r>
-        <w:t xml:space="preserve">( </w:t>
-      </w:r>
-      <w:bookmarkStart w:id="0" w:name="_GoBack"/>
-      <w:bookmarkEnd w:id="0"/>
-      <w:proofErr w:type="gramEnd"/>
-      <w:r>
-        <w:fldChar w:fldCharType="begin"/>
-      </w:r>
-      <w:r>
-        <w:instrText xml:space="preserve"> HYPERLINK "</w:instrText>
-      </w:r>
-      <w:r>
-        <w:instrText>https://github.com/gohmann174442049/POD4.5</w:instrText>
-      </w:r>
-      <w:r>
-        <w:instrText xml:space="preserve">" </w:instrText>
-      </w:r>
-      <w:r>
-        <w:fldChar w:fldCharType="separate"/>
-      </w:r>
-      <w:r>
-        <w:rPr>
-          <w:rStyle w:val="Hyperlink"/>
-        </w:rPr>
-        <w:t>https://github.com/gohmann174442049/POD4.5</w:t>
-      </w:r>
-      <w:r>
-        <w:fldChar w:fldCharType="end"/>
-      </w:r>
-      <w:r>
-        <w:t xml:space="preserve"> ).</w:t>
-      </w:r>
-    </w:p>
     <w:sectPr>
       <w:pgSz w:w="12240" w:h="15840"/>
       <w:pgMar w:top="1440" w:right="1440" w:bottom="1440" w:left="1440" w:header="720" w:footer="720" w:gutter="0"/>
@@ -199,7 +141,7 @@
 </file>
 
 <file path=word/styles.xml><?xml version="1.0" encoding="utf-8"?>
-<w:styles xmlns:mc="http://schemas.openxmlformats.org/markup-compatibility/2006" xmlns:r="http://schemas.openxmlformats.org/officeDocument/2006/relationships" xmlns:w="http://schemas.openxmlformats.org/wordprocessingml/2006/main" xmlns:w14="http://schemas.microsoft.com/office/word/2010/wordml" xmlns:w15="http://schemas.microsoft.com/office/word/2012/wordml" xmlns:w16se="http://schemas.microsoft.com/office/word/2015/wordml/symex" mc:Ignorable="w14 w15 w16se">
+<w:styles xmlns:mc="http://schemas.openxmlformats.org/markup-compatibility/2006" xmlns:r="http://schemas.openxmlformats.org/officeDocument/2006/relationships" xmlns:w="http://schemas.openxmlformats.org/wordprocessingml/2006/main" xmlns:w14="http://schemas.microsoft.com/office/word/2010/wordml" xmlns:w15="http://schemas.microsoft.com/office/word/2012/wordml" xmlns:w16cex="http://schemas.microsoft.com/office/word/2018/wordml/cex" xmlns:w16cid="http://schemas.microsoft.com/office/word/2016/wordml/cid" xmlns:w16="http://schemas.microsoft.com/office/word/2018/wordml" xmlns:w16du="http://schemas.microsoft.com/office/word/2023/wordml/word16du" xmlns:w16sdtdh="http://schemas.microsoft.com/office/word/2020/wordml/sdtdatahash" xmlns:w16sdtfl="http://schemas.microsoft.com/office/word/2024/wordml/sdtformatlock" xmlns:w16se="http://schemas.microsoft.com/office/word/2015/wordml/symex" mc:Ignorable="w14 w15 w16se w16cid w16 w16cex w16sdtdh w16sdtfl w16du">
   <w:docDefaults>
     <w:rPrDefault>
       <w:rPr>
@@ -215,7 +157,7 @@
       </w:pPr>
     </w:pPrDefault>
   </w:docDefaults>
-  <w:latentStyles w:defLockedState="0" w:defUIPriority="99" w:defSemiHidden="0" w:defUnhideWhenUsed="0" w:defQFormat="0" w:count="371">
+  <w:latentStyles w:defLockedState="0" w:defUIPriority="99" w:defSemiHidden="0" w:defUnhideWhenUsed="0" w:defQFormat="0" w:count="376">
     <w:lsdException w:name="Normal" w:uiPriority="0" w:qFormat="1"/>
     <w:lsdException w:name="heading 1" w:uiPriority="9" w:qFormat="1"/>
     <w:lsdException w:name="heading 2" w:semiHidden="1" w:uiPriority="9" w:unhideWhenUsed="1" w:qFormat="1"/>
@@ -587,6 +529,11 @@
     <w:lsdException w:name="List Table 5 Dark Accent 6" w:uiPriority="50"/>
     <w:lsdException w:name="List Table 6 Colorful Accent 6" w:uiPriority="51"/>
     <w:lsdException w:name="List Table 7 Colorful Accent 6" w:uiPriority="52"/>
+    <w:lsdException w:name="Mention" w:semiHidden="1" w:unhideWhenUsed="1"/>
+    <w:lsdException w:name="Smart Hyperlink" w:semiHidden="1" w:unhideWhenUsed="1"/>
+    <w:lsdException w:name="Hashtag" w:semiHidden="1" w:unhideWhenUsed="1"/>
+    <w:lsdException w:name="Unresolved Mention" w:semiHidden="1" w:unhideWhenUsed="1"/>
+    <w:lsdException w:name="Smart Link" w:semiHidden="1" w:unhideWhenUsed="1"/>
   </w:latentStyles>
   <w:style w:type="paragraph" w:default="1" w:styleId="Normal">
     <w:name w:val="Normal"/>
@@ -892,4 +839,10 @@
     </a:ext>
   </a:extLst>
 </a:theme>
+</file>
+
+<file path=docMetadata/LabelInfo.xml><?xml version="1.0" encoding="utf-8"?>
+<clbl:labelList xmlns:clbl="http://schemas.microsoft.com/office/2020/mipLabelMetadata">
+  <clbl:label id="{1bd84cd2-a803-4625-aaf7-424aaac7782e}" enabled="1" method="Standard" siteId="{8331b18d-2d87-48ef-a35f-ac8818ebf9b4}" contentBits="0" removed="0"/>
+</clbl:labelList>
 </file>
</xml_diff>